<commit_message>
Reducir a 27 hojas, quitar encabezado y pie, completar control de asistencia y ampliar recomendaciones y dificultades
</commit_message>
<xml_diff>
--- a/Informe de Practica Profesional - David Elias Chavez Dubon.docx
+++ b/Informe de Practica Profesional - David Elias Chavez Dubon.docx
@@ -343,7 +343,7 @@
         <w:tabs>
           <w:tab w:pos="9014" w:val="right" w:leader="dot"/>
         </w:tabs>
-        <w:spacing w:line="360" w:lineRule="auto" w:after="120"/>
+        <w:spacing w:line="360" w:lineRule="auto" w:after="200"/>
         <w:jc w:val="left"/>
       </w:pPr>
       <w:r>
@@ -370,7 +370,7 @@
         <w:tabs>
           <w:tab w:pos="9014" w:val="right" w:leader="dot"/>
         </w:tabs>
-        <w:spacing w:line="360" w:lineRule="auto" w:after="120"/>
+        <w:spacing w:line="360" w:lineRule="auto" w:after="200"/>
         <w:jc w:val="left"/>
       </w:pPr>
       <w:r>
@@ -397,7 +397,7 @@
         <w:tabs>
           <w:tab w:pos="9014" w:val="right" w:leader="dot"/>
         </w:tabs>
-        <w:spacing w:line="360" w:lineRule="auto" w:after="120"/>
+        <w:spacing w:line="360" w:lineRule="auto" w:after="200"/>
         <w:jc w:val="left"/>
       </w:pPr>
       <w:r>
@@ -424,7 +424,7 @@
         <w:tabs>
           <w:tab w:pos="9014" w:val="right" w:leader="dot"/>
         </w:tabs>
-        <w:spacing w:line="360" w:lineRule="auto" w:after="120"/>
+        <w:spacing w:line="360" w:lineRule="auto" w:after="200"/>
         <w:jc w:val="left"/>
       </w:pPr>
       <w:r>
@@ -451,7 +451,7 @@
         <w:tabs>
           <w:tab w:pos="9014" w:val="right" w:leader="dot"/>
         </w:tabs>
-        <w:spacing w:line="360" w:lineRule="auto" w:after="120"/>
+        <w:spacing w:line="360" w:lineRule="auto" w:after="200"/>
         <w:jc w:val="left"/>
       </w:pPr>
       <w:r>
@@ -478,7 +478,7 @@
         <w:tabs>
           <w:tab w:pos="9014" w:val="right" w:leader="dot"/>
         </w:tabs>
-        <w:spacing w:line="360" w:lineRule="auto" w:after="120"/>
+        <w:spacing w:line="360" w:lineRule="auto" w:after="200"/>
         <w:jc w:val="left"/>
       </w:pPr>
       <w:r>
@@ -505,7 +505,7 @@
         <w:tabs>
           <w:tab w:pos="9014" w:val="right" w:leader="dot"/>
         </w:tabs>
-        <w:spacing w:line="360" w:lineRule="auto" w:after="120"/>
+        <w:spacing w:line="360" w:lineRule="auto" w:after="200"/>
         <w:jc w:val="left"/>
       </w:pPr>
       <w:r>
@@ -532,7 +532,7 @@
         <w:tabs>
           <w:tab w:pos="9014" w:val="right" w:leader="dot"/>
         </w:tabs>
-        <w:spacing w:line="360" w:lineRule="auto" w:after="120"/>
+        <w:spacing w:line="360" w:lineRule="auto" w:after="200"/>
         <w:jc w:val="left"/>
       </w:pPr>
       <w:r>
@@ -559,61 +559,7 @@
         <w:tabs>
           <w:tab w:pos="9014" w:val="right" w:leader="dot"/>
         </w:tabs>
-        <w:spacing w:line="360" w:lineRule="auto" w:after="120"/>
-        <w:jc w:val="left"/>
-      </w:pPr>
-      <w:r>
-        <w:rPr>
-          <w:rFonts w:ascii="Arial" w:hAnsi="Arial"/>
-          <w:color w:val="1A1A1A"/>
-          <w:sz w:val="24"/>
-        </w:rPr>
-        <w:t>Hoja de referencia del tutor empresarial</w:t>
-      </w:r>
-      <w:r>
-        <w:rPr>
-          <w:rFonts w:ascii="Arial" w:hAnsi="Arial"/>
-          <w:b/>
-          <w:color w:val="A67C00"/>
-          <w:sz w:val="24"/>
-        </w:rPr>
-        <w:tab/>
-        <w:t>14</w:t>
-      </w:r>
-    </w:p>
-    <w:p>
-      <w:pPr>
-        <w:tabs>
-          <w:tab w:pos="9014" w:val="right" w:leader="dot"/>
-        </w:tabs>
-        <w:spacing w:line="360" w:lineRule="auto" w:after="120"/>
-        <w:jc w:val="left"/>
-      </w:pPr>
-      <w:r>
-        <w:rPr>
-          <w:rFonts w:ascii="Arial" w:hAnsi="Arial"/>
-          <w:color w:val="1A1A1A"/>
-          <w:sz w:val="24"/>
-        </w:rPr>
-        <w:t>Criterios a evaluar</w:t>
-      </w:r>
-      <w:r>
-        <w:rPr>
-          <w:rFonts w:ascii="Arial" w:hAnsi="Arial"/>
-          <w:b/>
-          <w:color w:val="A67C00"/>
-          <w:sz w:val="24"/>
-        </w:rPr>
-        <w:tab/>
-        <w:t>15</w:t>
-      </w:r>
-    </w:p>
-    <w:p>
-      <w:pPr>
-        <w:tabs>
-          <w:tab w:pos="9014" w:val="right" w:leader="dot"/>
-        </w:tabs>
-        <w:spacing w:line="360" w:lineRule="auto" w:after="120"/>
+        <w:spacing w:line="360" w:lineRule="auto" w:after="200"/>
         <w:jc w:val="left"/>
       </w:pPr>
       <w:r>
@@ -632,7 +578,7 @@
           <w:sz w:val="24"/>
         </w:rPr>
         <w:tab/>
-        <w:t>16</w:t>
+        <w:t>14</w:t>
       </w:r>
     </w:p>
     <w:p>
@@ -640,7 +586,7 @@
         <w:tabs>
           <w:tab w:pos="9014" w:val="right" w:leader="dot"/>
         </w:tabs>
-        <w:spacing w:line="360" w:lineRule="auto" w:after="120"/>
+        <w:spacing w:line="360" w:lineRule="auto" w:after="200"/>
         <w:jc w:val="left"/>
       </w:pPr>
       <w:r>
@@ -659,7 +605,7 @@
           <w:sz w:val="24"/>
         </w:rPr>
         <w:tab/>
-        <w:t>17</w:t>
+        <w:t>15</w:t>
       </w:r>
     </w:p>
     <w:p>
@@ -667,7 +613,7 @@
         <w:tabs>
           <w:tab w:pos="9014" w:val="right" w:leader="dot"/>
         </w:tabs>
-        <w:spacing w:line="360" w:lineRule="auto" w:after="120"/>
+        <w:spacing w:line="360" w:lineRule="auto" w:after="200"/>
         <w:jc w:val="left"/>
       </w:pPr>
       <w:r>
@@ -686,7 +632,7 @@
           <w:sz w:val="24"/>
         </w:rPr>
         <w:tab/>
-        <w:t>18</w:t>
+        <w:t>16</w:t>
       </w:r>
     </w:p>
     <w:p>
@@ -694,7 +640,7 @@
         <w:tabs>
           <w:tab w:pos="9014" w:val="right" w:leader="dot"/>
         </w:tabs>
-        <w:spacing w:line="360" w:lineRule="auto" w:after="120"/>
+        <w:spacing w:line="360" w:lineRule="auto" w:after="200"/>
         <w:jc w:val="left"/>
       </w:pPr>
       <w:r>
@@ -713,7 +659,7 @@
           <w:sz w:val="24"/>
         </w:rPr>
         <w:tab/>
-        <w:t>19</w:t>
+        <w:t>17</w:t>
       </w:r>
     </w:p>
     <w:p>
@@ -721,34 +667,7 @@
         <w:tabs>
           <w:tab w:pos="9014" w:val="right" w:leader="dot"/>
         </w:tabs>
-        <w:spacing w:line="360" w:lineRule="auto" w:after="120"/>
-        <w:jc w:val="left"/>
-      </w:pPr>
-      <w:r>
-        <w:rPr>
-          <w:rFonts w:ascii="Arial" w:hAnsi="Arial"/>
-          <w:color w:val="1A1A1A"/>
-          <w:sz w:val="24"/>
-        </w:rPr>
-        <w:t>Carta de remisión</w:t>
-      </w:r>
-      <w:r>
-        <w:rPr>
-          <w:rFonts w:ascii="Arial" w:hAnsi="Arial"/>
-          <w:b/>
-          <w:color w:val="A67C00"/>
-          <w:sz w:val="24"/>
-        </w:rPr>
-        <w:tab/>
-        <w:t>20</w:t>
-      </w:r>
-    </w:p>
-    <w:p>
-      <w:pPr>
-        <w:tabs>
-          <w:tab w:pos="9014" w:val="right" w:leader="dot"/>
-        </w:tabs>
-        <w:spacing w:line="360" w:lineRule="auto" w:after="120"/>
+        <w:spacing w:line="360" w:lineRule="auto" w:after="200"/>
         <w:jc w:val="left"/>
       </w:pPr>
       <w:r>
@@ -767,7 +686,7 @@
           <w:sz w:val="24"/>
         </w:rPr>
         <w:tab/>
-        <w:t>21</w:t>
+        <w:t>18</w:t>
       </w:r>
     </w:p>
     <w:p>
@@ -775,61 +694,7 @@
         <w:tabs>
           <w:tab w:pos="9014" w:val="right" w:leader="dot"/>
         </w:tabs>
-        <w:spacing w:line="360" w:lineRule="auto" w:after="120"/>
-        <w:jc w:val="left"/>
-      </w:pPr>
-      <w:r>
-        <w:rPr>
-          <w:rFonts w:ascii="Arial" w:hAnsi="Arial"/>
-          <w:color w:val="1A1A1A"/>
-          <w:sz w:val="24"/>
-        </w:rPr>
-        <w:t>Solicitud de práctica profesional</w:t>
-      </w:r>
-      <w:r>
-        <w:rPr>
-          <w:rFonts w:ascii="Arial" w:hAnsi="Arial"/>
-          <w:b/>
-          <w:color w:val="A67C00"/>
-          <w:sz w:val="24"/>
-        </w:rPr>
-        <w:tab/>
-        <w:t>22</w:t>
-      </w:r>
-    </w:p>
-    <w:p>
-      <w:pPr>
-        <w:tabs>
-          <w:tab w:pos="9014" w:val="right" w:leader="dot"/>
-        </w:tabs>
-        <w:spacing w:line="360" w:lineRule="auto" w:after="120"/>
-        <w:jc w:val="left"/>
-      </w:pPr>
-      <w:r>
-        <w:rPr>
-          <w:rFonts w:ascii="Arial" w:hAnsi="Arial"/>
-          <w:color w:val="1A1A1A"/>
-          <w:sz w:val="24"/>
-        </w:rPr>
-        <w:t>Credencial</w:t>
-      </w:r>
-      <w:r>
-        <w:rPr>
-          <w:rFonts w:ascii="Arial" w:hAnsi="Arial"/>
-          <w:b/>
-          <w:color w:val="A67C00"/>
-          <w:sz w:val="24"/>
-        </w:rPr>
-        <w:tab/>
-        <w:t>23</w:t>
-      </w:r>
-    </w:p>
-    <w:p>
-      <w:pPr>
-        <w:tabs>
-          <w:tab w:pos="9014" w:val="right" w:leader="dot"/>
-        </w:tabs>
-        <w:spacing w:line="360" w:lineRule="auto" w:after="120"/>
+        <w:spacing w:line="360" w:lineRule="auto" w:after="200"/>
         <w:jc w:val="left"/>
       </w:pPr>
       <w:r>
@@ -848,7 +713,7 @@
           <w:sz w:val="24"/>
         </w:rPr>
         <w:tab/>
-        <w:t>24</w:t>
+        <w:t>19</w:t>
       </w:r>
     </w:p>
     <w:p>
@@ -856,7 +721,7 @@
         <w:tabs>
           <w:tab w:pos="9014" w:val="right" w:leader="dot"/>
         </w:tabs>
-        <w:spacing w:line="360" w:lineRule="auto" w:after="120"/>
+        <w:spacing w:line="360" w:lineRule="auto" w:after="200"/>
         <w:jc w:val="left"/>
       </w:pPr>
       <w:r>
@@ -875,7 +740,7 @@
           <w:sz w:val="24"/>
         </w:rPr>
         <w:tab/>
-        <w:t>25</w:t>
+        <w:t>20</w:t>
       </w:r>
     </w:p>
     <w:p>
@@ -883,7 +748,7 @@
         <w:tabs>
           <w:tab w:pos="9014" w:val="right" w:leader="dot"/>
         </w:tabs>
-        <w:spacing w:line="360" w:lineRule="auto" w:after="120"/>
+        <w:spacing w:line="360" w:lineRule="auto" w:after="200"/>
         <w:jc w:val="left"/>
       </w:pPr>
       <w:r>
@@ -902,7 +767,7 @@
           <w:sz w:val="24"/>
         </w:rPr>
         <w:tab/>
-        <w:t>31</w:t>
+        <w:t>24</w:t>
       </w:r>
     </w:p>
     <w:p>
@@ -910,7 +775,7 @@
         <w:tabs>
           <w:tab w:pos="9014" w:val="right" w:leader="dot"/>
         </w:tabs>
-        <w:spacing w:line="360" w:lineRule="auto" w:after="120"/>
+        <w:spacing w:line="360" w:lineRule="auto" w:after="200"/>
         <w:jc w:val="left"/>
       </w:pPr>
       <w:r>
@@ -929,7 +794,7 @@
           <w:sz w:val="24"/>
         </w:rPr>
         <w:tab/>
-        <w:t>33</w:t>
+        <w:t>26</w:t>
       </w:r>
     </w:p>
     <w:p>
@@ -937,7 +802,7 @@
         <w:tabs>
           <w:tab w:pos="9014" w:val="right" w:leader="dot"/>
         </w:tabs>
-        <w:spacing w:line="360" w:lineRule="auto" w:after="120"/>
+        <w:spacing w:line="360" w:lineRule="auto" w:after="200"/>
         <w:jc w:val="left"/>
       </w:pPr>
       <w:r>
@@ -956,7 +821,7 @@
           <w:sz w:val="24"/>
         </w:rPr>
         <w:tab/>
-        <w:t>34</w:t>
+        <w:t>27</w:t>
       </w:r>
     </w:p>
     <w:p>
@@ -1816,7 +1681,7 @@
                 <w:color w:val="595959"/>
                 <w:sz w:val="22"/>
               </w:rPr>
-              <w:t>Pega la imagen del organigrama que solicitaste a la empresa.</w:t>
+              <w:t>Pega la imagen del organigrama que te dio la empresa.</w:t>
             </w:r>
           </w:p>
           <w:p>
@@ -2124,7 +1989,7 @@
     </w:p>
     <w:p>
       <w:pPr>
-        <w:spacing w:line="360" w:lineRule="auto" w:after="800"/>
+        <w:spacing w:line="360" w:lineRule="auto" w:after="720"/>
         <w:ind w:left="567"/>
         <w:jc w:val="both"/>
       </w:pPr>
@@ -2164,7 +2029,7 @@
     </w:p>
     <w:p>
       <w:pPr>
-        <w:spacing w:line="360" w:lineRule="auto" w:after="800"/>
+        <w:spacing w:line="360" w:lineRule="auto" w:after="720"/>
         <w:ind w:left="567"/>
         <w:jc w:val="both"/>
       </w:pPr>
@@ -2204,7 +2069,7 @@
     </w:p>
     <w:p>
       <w:pPr>
-        <w:spacing w:line="360" w:lineRule="auto" w:after="800"/>
+        <w:spacing w:line="360" w:lineRule="auto" w:after="720"/>
         <w:ind w:left="567"/>
         <w:jc w:val="both"/>
       </w:pPr>
@@ -2264,7 +2129,7 @@
     </w:p>
     <w:p>
       <w:pPr>
-        <w:spacing w:line="360" w:lineRule="auto" w:after="800"/>
+        <w:spacing w:line="360" w:lineRule="auto" w:after="720"/>
         <w:ind w:left="567"/>
         <w:jc w:val="both"/>
       </w:pPr>
@@ -2304,7 +2169,7 @@
     </w:p>
     <w:p>
       <w:pPr>
-        <w:spacing w:line="360" w:lineRule="auto" w:after="800"/>
+        <w:spacing w:line="360" w:lineRule="auto" w:after="720"/>
         <w:ind w:left="567"/>
         <w:jc w:val="both"/>
       </w:pPr>
@@ -2344,7 +2209,7 @@
     </w:p>
     <w:p>
       <w:pPr>
-        <w:spacing w:line="360" w:lineRule="auto" w:after="800"/>
+        <w:spacing w:line="360" w:lineRule="auto" w:after="720"/>
         <w:ind w:left="567"/>
         <w:jc w:val="both"/>
       </w:pPr>
@@ -2404,7 +2269,7 @@
     </w:p>
     <w:p>
       <w:pPr>
-        <w:spacing w:line="360" w:lineRule="auto" w:after="800"/>
+        <w:spacing w:line="360" w:lineRule="auto" w:after="720"/>
         <w:ind w:left="567"/>
         <w:jc w:val="both"/>
       </w:pPr>
@@ -2444,7 +2309,7 @@
     </w:p>
     <w:p>
       <w:pPr>
-        <w:spacing w:line="360" w:lineRule="auto" w:after="800"/>
+        <w:spacing w:line="360" w:lineRule="auto" w:after="720"/>
         <w:ind w:left="567"/>
         <w:jc w:val="both"/>
       </w:pPr>
@@ -2484,7 +2349,7 @@
     </w:p>
     <w:p>
       <w:pPr>
-        <w:spacing w:line="360" w:lineRule="auto" w:after="800"/>
+        <w:spacing w:line="360" w:lineRule="auto" w:after="720"/>
         <w:ind w:left="567"/>
         <w:jc w:val="both"/>
       </w:pPr>
@@ -2539,12 +2404,12 @@
           <w:color w:val="1F3864"/>
           <w:sz w:val="25"/>
         </w:rPr>
-        <w:t>Revisión de información en la plataforma Indexa</w:t>
+        <w:t>Revisión y corrección de fechas en los registros</w:t>
       </w:r>
     </w:p>
     <w:p>
       <w:pPr>
-        <w:spacing w:line="360" w:lineRule="auto" w:after="800"/>
+        <w:spacing w:line="360" w:lineRule="auto" w:after="720"/>
         <w:ind w:left="567"/>
         <w:jc w:val="both"/>
       </w:pPr>
@@ -2554,7 +2419,7 @@
           <w:color w:val="1A1A1A"/>
           <w:sz w:val="24"/>
         </w:rPr>
-        <w:t>Comparé la información subida a la plataforma Indexa con la que estaba registrada en el sistema contable. En esa revisión encontré dos fechas invertidas y las corregí.</w:t>
+        <w:t>Al terminar de contabilizar las facturas de un proyecto revisé todo lo que había pasado a VisionWin. Ahí me di cuenta de que la plataforma Indexa mostraba las fechas al revés, primero el mes y después el día, por un error que quedó cuando se actualizó el sistema, y con esa fecha equivocada yo había contabilizado dos facturas. Corregí las dos fechas para dejarlas como eran en realidad.</w:t>
       </w:r>
     </w:p>
     <w:p>
@@ -2584,7 +2449,7 @@
     </w:p>
     <w:p>
       <w:pPr>
-        <w:spacing w:line="360" w:lineRule="auto" w:after="800"/>
+        <w:spacing w:line="360" w:lineRule="auto" w:after="720"/>
         <w:ind w:left="567"/>
         <w:jc w:val="both"/>
       </w:pPr>
@@ -2624,7 +2489,7 @@
     </w:p>
     <w:p>
       <w:pPr>
-        <w:spacing w:line="360" w:lineRule="auto" w:after="800"/>
+        <w:spacing w:line="360" w:lineRule="auto" w:after="720"/>
         <w:ind w:left="567"/>
         <w:jc w:val="both"/>
       </w:pPr>
@@ -2644,223 +2509,7 @@
           <w:bottom w:val="single" w:sz="18" w:space="0" w:color="BF9B30"/>
         </w:pBdr>
         <w:shd w:val="clear" w:color="auto" w:fill="1F3864"/>
-        <w:spacing w:line="360" w:lineRule="auto" w:before="0" w:after="360"/>
-        <w:jc w:val="center"/>
-      </w:pPr>
-      <w:r>
-        <w:rPr>
-          <w:rFonts w:ascii="Arial" w:hAnsi="Arial"/>
-          <w:b/>
-          <w:color w:val="FFFFFF"/>
-          <w:sz w:val="30"/>
-        </w:rPr>
-        <w:t>HOJA DE REFERENCIA DEL TUTOR EMPRESARIAL</w:t>
-      </w:r>
-    </w:p>
-    <w:tbl>
-      <w:tblPr>
-        <w:tblW w:type="auto" w:w="0"/>
-        <w:jc w:val="center"/>
-        <w:tblLayout w:type="fixed"/>
-        <w:tblLook w:firstColumn="1" w:firstRow="1" w:lastColumn="0" w:lastRow="0" w:noHBand="0" w:noVBand="1" w:val="04A0"/>
-        <w:tblBorders>
-          <w:top w:val="single" w:sz="8" w:space="0" w:color="2E5F8A"/>
-          <w:left w:val="single" w:sz="8" w:space="0" w:color="2E5F8A"/>
-          <w:bottom w:val="single" w:sz="8" w:space="0" w:color="2E5F8A"/>
-          <w:right w:val="single" w:sz="8" w:space="0" w:color="2E5F8A"/>
-          <w:insideH w:val="single" w:sz="8" w:space="0" w:color="2E5F8A"/>
-          <w:insideV w:val="single" w:sz="8" w:space="0" w:color="2E5F8A"/>
-        </w:tblBorders>
-        <w:tblCellMar>
-          <w:top w:w="170" w:type="dxa"/>
-          <w:left w:w="170" w:type="dxa"/>
-          <w:bottom w:w="170" w:type="dxa"/>
-          <w:right w:w="170" w:type="dxa"/>
-        </w:tblCellMar>
-      </w:tblPr>
-      <w:tblGrid>
-        <w:gridCol w:w="9071"/>
-      </w:tblGrid>
-      <w:tr>
-        <w:trPr>
-          <w:trHeight w:val="10886" w:hRule="exact"/>
-        </w:trPr>
-        <w:tc>
-          <w:tcPr>
-            <w:tcW w:type="dxa" w:w="9071"/>
-            <w:vAlign w:val="center"/>
-            <w:shd w:val="clear" w:color="auto" w:fill="F2F6FA"/>
-          </w:tcPr>
-          <w:p>
-            <w:pPr>
-              <w:spacing w:line="360" w:lineRule="auto" w:after="280"/>
-              <w:jc w:val="center"/>
-            </w:pPr>
-            <w:r/>
-            <w:r>
-              <w:rPr>
-                <w:rFonts w:ascii="Arial" w:hAnsi="Arial"/>
-                <w:b/>
-                <w:color w:val="1F3864"/>
-                <w:sz w:val="24"/>
-              </w:rPr>
-              <w:t>AQUÍ VA EL FORMATO DE LA SECRETARÍA DE EDUCACIÓN</w:t>
-            </w:r>
-          </w:p>
-          <w:p>
-            <w:pPr>
-              <w:spacing w:line="360" w:lineRule="auto" w:after="200"/>
-              <w:jc w:val="center"/>
-            </w:pPr>
-            <w:r>
-              <w:rPr>
-                <w:rFonts w:ascii="Arial" w:hAnsi="Arial"/>
-                <w:color w:val="595959"/>
-                <w:sz w:val="22"/>
-              </w:rPr>
-              <w:t>Es la hoja con valor del 40 % que entrega el catedrático.</w:t>
-            </w:r>
-          </w:p>
-          <w:p>
-            <w:pPr>
-              <w:spacing w:line="360" w:lineRule="auto" w:after="200"/>
-              <w:jc w:val="center"/>
-            </w:pPr>
-            <w:r>
-              <w:rPr>
-                <w:rFonts w:ascii="Arial" w:hAnsi="Arial"/>
-                <w:color w:val="595959"/>
-                <w:sz w:val="22"/>
-              </w:rPr>
-              <w:t>El tutor de la empresa evalúa cada semana de la práctica.</w:t>
-            </w:r>
-          </w:p>
-          <w:p>
-            <w:pPr>
-              <w:spacing w:line="360" w:lineRule="auto" w:after="200"/>
-              <w:jc w:val="center"/>
-            </w:pPr>
-            <w:r>
-              <w:rPr>
-                <w:rFonts w:ascii="Arial" w:hAnsi="Arial"/>
-                <w:color w:val="595959"/>
-                <w:sz w:val="22"/>
-              </w:rPr>
-              <w:t>Debe ir llena, firmada y sellada. Escanéala y pégala aquí.</w:t>
-            </w:r>
-          </w:p>
-        </w:tc>
-      </w:tr>
-    </w:tbl>
-    <w:p>
-      <w:pPr>
-        <w:pageBreakBefore/>
-        <w:pBdr>
-          <w:bottom w:val="single" w:sz="18" w:space="0" w:color="BF9B30"/>
-        </w:pBdr>
-        <w:shd w:val="clear" w:color="auto" w:fill="1F3864"/>
-        <w:spacing w:line="360" w:lineRule="auto" w:before="0" w:after="360"/>
-        <w:jc w:val="center"/>
-      </w:pPr>
-      <w:r>
-        <w:rPr>
-          <w:rFonts w:ascii="Arial" w:hAnsi="Arial"/>
-          <w:b/>
-          <w:color w:val="FFFFFF"/>
-          <w:sz w:val="36"/>
-        </w:rPr>
-        <w:t>CRITERIOS A EVALUAR</w:t>
-      </w:r>
-    </w:p>
-    <w:tbl>
-      <w:tblPr>
-        <w:tblW w:type="auto" w:w="0"/>
-        <w:jc w:val="center"/>
-        <w:tblLayout w:type="fixed"/>
-        <w:tblLook w:firstColumn="1" w:firstRow="1" w:lastColumn="0" w:lastRow="0" w:noHBand="0" w:noVBand="1" w:val="04A0"/>
-        <w:tblBorders>
-          <w:top w:val="single" w:sz="8" w:space="0" w:color="2E5F8A"/>
-          <w:left w:val="single" w:sz="8" w:space="0" w:color="2E5F8A"/>
-          <w:bottom w:val="single" w:sz="8" w:space="0" w:color="2E5F8A"/>
-          <w:right w:val="single" w:sz="8" w:space="0" w:color="2E5F8A"/>
-          <w:insideH w:val="single" w:sz="8" w:space="0" w:color="2E5F8A"/>
-          <w:insideV w:val="single" w:sz="8" w:space="0" w:color="2E5F8A"/>
-        </w:tblBorders>
-        <w:tblCellMar>
-          <w:top w:w="170" w:type="dxa"/>
-          <w:left w:w="170" w:type="dxa"/>
-          <w:bottom w:w="170" w:type="dxa"/>
-          <w:right w:w="170" w:type="dxa"/>
-        </w:tblCellMar>
-      </w:tblPr>
-      <w:tblGrid>
-        <w:gridCol w:w="9071"/>
-      </w:tblGrid>
-      <w:tr>
-        <w:trPr>
-          <w:trHeight w:val="10886" w:hRule="exact"/>
-        </w:trPr>
-        <w:tc>
-          <w:tcPr>
-            <w:tcW w:type="dxa" w:w="9071"/>
-            <w:vAlign w:val="center"/>
-            <w:shd w:val="clear" w:color="auto" w:fill="F2F6FA"/>
-          </w:tcPr>
-          <w:p>
-            <w:pPr>
-              <w:spacing w:line="360" w:lineRule="auto" w:after="280"/>
-              <w:jc w:val="center"/>
-            </w:pPr>
-            <w:r/>
-            <w:r>
-              <w:rPr>
-                <w:rFonts w:ascii="Arial" w:hAnsi="Arial"/>
-                <w:b/>
-                <w:color w:val="1F3864"/>
-                <w:sz w:val="24"/>
-              </w:rPr>
-              <w:t>AQUÍ VA EL CUADRO DE CRITERIOS A EVALUAR</w:t>
-            </w:r>
-          </w:p>
-          <w:p>
-            <w:pPr>
-              <w:spacing w:line="360" w:lineRule="auto" w:after="200"/>
-              <w:jc w:val="center"/>
-            </w:pPr>
-            <w:r>
-              <w:rPr>
-                <w:rFonts w:ascii="Arial" w:hAnsi="Arial"/>
-                <w:color w:val="595959"/>
-                <w:sz w:val="22"/>
-              </w:rPr>
-              <w:t>Es la segunda hoja del formato de la Secretaría de Educación, con los ocho criterios que el tutor evalúa en las cuatro semanas.</w:t>
-            </w:r>
-          </w:p>
-          <w:p>
-            <w:pPr>
-              <w:spacing w:line="360" w:lineRule="auto" w:after="200"/>
-              <w:jc w:val="center"/>
-            </w:pPr>
-            <w:r>
-              <w:rPr>
-                <w:rFonts w:ascii="Arial" w:hAnsi="Arial"/>
-                <w:color w:val="595959"/>
-                <w:sz w:val="22"/>
-              </w:rPr>
-              <w:t>Debe traer el puntaje de cada semana, el total y la firma y sello del tutor.</w:t>
-            </w:r>
-          </w:p>
-        </w:tc>
-      </w:tr>
-    </w:tbl>
-    <w:p>
-      <w:pPr>
-        <w:pageBreakBefore/>
-        <w:pBdr>
-          <w:bottom w:val="single" w:sz="18" w:space="0" w:color="BF9B30"/>
-        </w:pBdr>
-        <w:shd w:val="clear" w:color="auto" w:fill="1F3864"/>
-        <w:spacing w:line="360" w:lineRule="auto" w:before="0" w:after="480"/>
+        <w:spacing w:line="360" w:lineRule="auto" w:before="0" w:after="440"/>
         <w:jc w:val="center"/>
       </w:pPr>
       <w:r>
@@ -2875,7 +2524,7 @@
     </w:p>
     <w:p>
       <w:pPr>
-        <w:spacing w:line="360" w:lineRule="auto" w:after="320"/>
+        <w:spacing w:line="360" w:lineRule="auto" w:after="280"/>
         <w:ind w:left="510" w:hanging="510"/>
         <w:jc w:val="both"/>
       </w:pPr>
@@ -2899,7 +2548,7 @@
     </w:p>
     <w:p>
       <w:pPr>
-        <w:spacing w:line="360" w:lineRule="auto" w:after="320"/>
+        <w:spacing w:line="360" w:lineRule="auto" w:after="280"/>
         <w:ind w:left="510" w:hanging="510"/>
         <w:jc w:val="both"/>
       </w:pPr>
@@ -2923,7 +2572,7 @@
     </w:p>
     <w:p>
       <w:pPr>
-        <w:spacing w:line="360" w:lineRule="auto" w:after="320"/>
+        <w:spacing w:line="360" w:lineRule="auto" w:after="280"/>
         <w:ind w:left="510" w:hanging="510"/>
         <w:jc w:val="both"/>
       </w:pPr>
@@ -2947,7 +2596,7 @@
     </w:p>
     <w:p>
       <w:pPr>
-        <w:spacing w:line="360" w:lineRule="auto" w:after="320"/>
+        <w:spacing w:line="360" w:lineRule="auto" w:after="280"/>
         <w:ind w:left="510" w:hanging="510"/>
         <w:jc w:val="both"/>
       </w:pPr>
@@ -2971,7 +2620,31 @@
     </w:p>
     <w:p>
       <w:pPr>
-        <w:spacing w:line="360" w:lineRule="auto" w:after="320"/>
+        <w:spacing w:line="360" w:lineRule="auto" w:after="280"/>
+        <w:ind w:left="510" w:hanging="510"/>
+        <w:jc w:val="both"/>
+      </w:pPr>
+      <w:r>
+        <w:rPr>
+          <w:rFonts w:ascii="Arial" w:hAnsi="Arial"/>
+          <w:b/>
+          <w:color w:val="A67C00"/>
+          <w:sz w:val="24"/>
+        </w:rPr>
+        <w:t xml:space="preserve">▸  </w:t>
+      </w:r>
+      <w:r>
+        <w:rPr>
+          <w:rFonts w:ascii="Arial" w:hAnsi="Arial"/>
+          <w:color w:val="1A1A1A"/>
+          <w:sz w:val="24"/>
+        </w:rPr>
+        <w:t>Detecté y corregí las fechas que el sistema estaba registrando al revés.</w:t>
+      </w:r>
+    </w:p>
+    <w:p>
+      <w:pPr>
+        <w:spacing w:line="360" w:lineRule="auto" w:after="280"/>
         <w:ind w:left="510" w:hanging="510"/>
         <w:jc w:val="both"/>
       </w:pPr>
@@ -2995,7 +2668,7 @@
     </w:p>
     <w:p>
       <w:pPr>
-        <w:spacing w:line="360" w:lineRule="auto" w:after="320"/>
+        <w:spacing w:line="360" w:lineRule="auto" w:after="280"/>
         <w:ind w:left="510" w:hanging="510"/>
         <w:jc w:val="both"/>
       </w:pPr>
@@ -3019,7 +2692,7 @@
     </w:p>
     <w:p>
       <w:pPr>
-        <w:spacing w:line="360" w:lineRule="auto" w:after="320"/>
+        <w:spacing w:line="360" w:lineRule="auto" w:after="280"/>
         <w:ind w:left="510" w:hanging="510"/>
         <w:jc w:val="both"/>
       </w:pPr>
@@ -3043,7 +2716,7 @@
     </w:p>
     <w:p>
       <w:pPr>
-        <w:spacing w:line="360" w:lineRule="auto" w:after="320"/>
+        <w:spacing w:line="360" w:lineRule="auto" w:after="280"/>
         <w:ind w:left="510" w:hanging="510"/>
         <w:jc w:val="both"/>
       </w:pPr>
@@ -3072,7 +2745,7 @@
           <w:bottom w:val="single" w:sz="18" w:space="0" w:color="BF9B30"/>
         </w:pBdr>
         <w:shd w:val="clear" w:color="auto" w:fill="1F3864"/>
-        <w:spacing w:line="360" w:lineRule="auto" w:before="0" w:after="480"/>
+        <w:spacing w:line="360" w:lineRule="auto" w:before="0" w:after="440"/>
         <w:jc w:val="center"/>
       </w:pPr>
       <w:r>
@@ -3087,7 +2760,7 @@
     </w:p>
     <w:p>
       <w:pPr>
-        <w:spacing w:line="360" w:lineRule="auto" w:after="360"/>
+        <w:spacing w:line="360" w:lineRule="auto" w:after="280"/>
         <w:ind w:left="510" w:hanging="510"/>
         <w:jc w:val="both"/>
       </w:pPr>
@@ -3111,7 +2784,31 @@
     </w:p>
     <w:p>
       <w:pPr>
-        <w:spacing w:line="360" w:lineRule="auto" w:after="360"/>
+        <w:spacing w:line="360" w:lineRule="auto" w:after="280"/>
+        <w:ind w:left="510" w:hanging="510"/>
+        <w:jc w:val="both"/>
+      </w:pPr>
+      <w:r>
+        <w:rPr>
+          <w:rFonts w:ascii="Arial" w:hAnsi="Arial"/>
+          <w:b/>
+          <w:color w:val="A67C00"/>
+          <w:sz w:val="24"/>
+        </w:rPr>
+        <w:t xml:space="preserve">▸  </w:t>
+      </w:r>
+      <w:r>
+        <w:rPr>
+          <w:rFonts w:ascii="Arial" w:hAnsi="Arial"/>
+          <w:color w:val="1A1A1A"/>
+          <w:sz w:val="24"/>
+        </w:rPr>
+        <w:t>La plataforma Indexa mostraba las fechas al revés, primero el mes y después el día, por un error que quedó cuando se actualizó el sistema. Con esa fecha equivocada contabilicé dos facturas en VisionWin y tuve que revisar documento por documento para encontrarlas y corregirlas.</w:t>
+      </w:r>
+    </w:p>
+    <w:p>
+      <w:pPr>
+        <w:spacing w:line="360" w:lineRule="auto" w:after="280"/>
         <w:ind w:left="510" w:hanging="510"/>
         <w:jc w:val="both"/>
       </w:pPr>
@@ -3135,7 +2832,7 @@
     </w:p>
     <w:p>
       <w:pPr>
-        <w:spacing w:line="360" w:lineRule="auto" w:after="360"/>
+        <w:spacing w:line="360" w:lineRule="auto" w:after="280"/>
         <w:ind w:left="510" w:hanging="510"/>
         <w:jc w:val="both"/>
       </w:pPr>
@@ -3159,7 +2856,7 @@
     </w:p>
     <w:p>
       <w:pPr>
-        <w:spacing w:line="360" w:lineRule="auto" w:after="360"/>
+        <w:spacing w:line="360" w:lineRule="auto" w:after="280"/>
         <w:ind w:left="510" w:hanging="510"/>
         <w:jc w:val="both"/>
       </w:pPr>
@@ -3183,31 +2880,7 @@
     </w:p>
     <w:p>
       <w:pPr>
-        <w:spacing w:line="360" w:lineRule="auto" w:after="360"/>
-        <w:ind w:left="510" w:hanging="510"/>
-        <w:jc w:val="both"/>
-      </w:pPr>
-      <w:r>
-        <w:rPr>
-          <w:rFonts w:ascii="Arial" w:hAnsi="Arial"/>
-          <w:b/>
-          <w:color w:val="A67C00"/>
-          <w:sz w:val="24"/>
-        </w:rPr>
-        <w:t xml:space="preserve">▸  </w:t>
-      </w:r>
-      <w:r>
-        <w:rPr>
-          <w:rFonts w:ascii="Arial" w:hAnsi="Arial"/>
-          <w:color w:val="1A1A1A"/>
-          <w:sz w:val="24"/>
-        </w:rPr>
-        <w:t>Encontrar las fechas invertidas en la plataforma Indexa me obligó a revisar documento por documento.</w:t>
-      </w:r>
-    </w:p>
-    <w:p>
-      <w:pPr>
-        <w:spacing w:line="360" w:lineRule="auto" w:after="360"/>
+        <w:spacing w:line="360" w:lineRule="auto" w:after="280"/>
         <w:ind w:left="510" w:hanging="510"/>
         <w:jc w:val="both"/>
       </w:pPr>
@@ -3236,7 +2909,7 @@
           <w:bottom w:val="single" w:sz="18" w:space="0" w:color="BF9B30"/>
         </w:pBdr>
         <w:shd w:val="clear" w:color="auto" w:fill="1F3864"/>
-        <w:spacing w:line="360" w:lineRule="auto" w:before="0" w:after="480"/>
+        <w:spacing w:line="360" w:lineRule="auto" w:before="0" w:after="400"/>
         <w:jc w:val="center"/>
       </w:pPr>
       <w:r>
@@ -3251,7 +2924,7 @@
     </w:p>
     <w:p>
       <w:pPr>
-        <w:spacing w:line="360" w:lineRule="auto" w:after="400"/>
+        <w:spacing w:line="360" w:lineRule="auto" w:after="240"/>
         <w:ind w:left="510" w:hanging="510"/>
         <w:jc w:val="both"/>
       </w:pPr>
@@ -3270,12 +2943,12 @@
           <w:color w:val="1A1A1A"/>
           <w:sz w:val="24"/>
         </w:rPr>
-        <w:t>Llegar puntual y cumplir el horario completo desde el primer día.</w:t>
+        <w:t>Asistir todos los días y cumplir el horario completo desde el primero hasta el último día de la práctica.</w:t>
       </w:r>
     </w:p>
     <w:p>
       <w:pPr>
-        <w:spacing w:line="360" w:lineRule="auto" w:after="400"/>
+        <w:spacing w:line="360" w:lineRule="auto" w:after="240"/>
         <w:ind w:left="510" w:hanging="510"/>
         <w:jc w:val="both"/>
       </w:pPr>
@@ -3294,12 +2967,60 @@
           <w:color w:val="1A1A1A"/>
           <w:sz w:val="24"/>
         </w:rPr>
-        <w:t>Presentarse siempre con el uniforme completo y buena presentación.</w:t>
+        <w:t>Llegar puntual, porque es lo primero que la empresa toma en cuenta del practicante.</w:t>
       </w:r>
     </w:p>
     <w:p>
       <w:pPr>
-        <w:spacing w:line="360" w:lineRule="auto" w:after="400"/>
+        <w:spacing w:line="360" w:lineRule="auto" w:after="240"/>
+        <w:ind w:left="510" w:hanging="510"/>
+        <w:jc w:val="both"/>
+      </w:pPr>
+      <w:r>
+        <w:rPr>
+          <w:rFonts w:ascii="Arial" w:hAnsi="Arial"/>
+          <w:b/>
+          <w:color w:val="A67C00"/>
+          <w:sz w:val="24"/>
+        </w:rPr>
+        <w:t xml:space="preserve">▸  </w:t>
+      </w:r>
+      <w:r>
+        <w:rPr>
+          <w:rFonts w:ascii="Arial" w:hAnsi="Arial"/>
+          <w:color w:val="1A1A1A"/>
+          <w:sz w:val="24"/>
+        </w:rPr>
+        <w:t>Presentarse a diario con el uniforme completo y con buena presentación personal.</w:t>
+      </w:r>
+    </w:p>
+    <w:p>
+      <w:pPr>
+        <w:spacing w:line="360" w:lineRule="auto" w:after="240"/>
+        <w:ind w:left="510" w:hanging="510"/>
+        <w:jc w:val="both"/>
+      </w:pPr>
+      <w:r>
+        <w:rPr>
+          <w:rFonts w:ascii="Arial" w:hAnsi="Arial"/>
+          <w:b/>
+          <w:color w:val="A67C00"/>
+          <w:sz w:val="24"/>
+        </w:rPr>
+        <w:t xml:space="preserve">▸  </w:t>
+      </w:r>
+      <w:r>
+        <w:rPr>
+          <w:rFonts w:ascii="Arial" w:hAnsi="Arial"/>
+          <w:color w:val="1A1A1A"/>
+          <w:sz w:val="24"/>
+        </w:rPr>
+        <w:t>Cuidar el vocabulario y hablar con respeto, tanto con el personal como con los clientes que llegan a la oficina.</w:t>
+      </w:r>
+    </w:p>
+    <w:p>
+      <w:pPr>
+        <w:spacing w:line="360" w:lineRule="auto" w:after="240"/>
         <w:ind w:left="510" w:hanging="510"/>
         <w:jc w:val="both"/>
       </w:pPr>
@@ -3323,7 +3044,7 @@
     </w:p>
     <w:p>
       <w:pPr>
-        <w:spacing w:line="360" w:lineRule="auto" w:after="400"/>
+        <w:spacing w:line="360" w:lineRule="auto" w:after="240"/>
         <w:ind w:left="510" w:hanging="510"/>
         <w:jc w:val="both"/>
       </w:pPr>
@@ -3347,7 +3068,7 @@
     </w:p>
     <w:p>
       <w:pPr>
-        <w:spacing w:line="360" w:lineRule="auto" w:after="400"/>
+        <w:spacing w:line="360" w:lineRule="auto" w:after="240"/>
         <w:ind w:left="510" w:hanging="510"/>
         <w:jc w:val="both"/>
       </w:pPr>
@@ -3371,7 +3092,7 @@
     </w:p>
     <w:p>
       <w:pPr>
-        <w:spacing w:line="360" w:lineRule="auto" w:after="400"/>
+        <w:spacing w:line="360" w:lineRule="auto" w:after="240"/>
         <w:ind w:left="510" w:hanging="510"/>
         <w:jc w:val="both"/>
       </w:pPr>
@@ -3390,12 +3111,12 @@
           <w:color w:val="1A1A1A"/>
           <w:sz w:val="24"/>
         </w:rPr>
-        <w:t>Revisar el trabajo antes de darlo por terminado, sobre todo fechas y montos.</w:t>
+        <w:t>Revisar el trabajo antes de darlo por terminado, sobre todo las fechas y los montos.</w:t>
       </w:r>
     </w:p>
     <w:p>
       <w:pPr>
-        <w:spacing w:line="360" w:lineRule="auto" w:after="400"/>
+        <w:spacing w:line="360" w:lineRule="auto" w:after="240"/>
         <w:ind w:left="510" w:hanging="510"/>
         <w:jc w:val="both"/>
       </w:pPr>
@@ -3419,7 +3140,7 @@
     </w:p>
     <w:p>
       <w:pPr>
-        <w:spacing w:line="360" w:lineRule="auto" w:after="400"/>
+        <w:spacing w:line="360" w:lineRule="auto" w:after="240"/>
         <w:ind w:left="510" w:hanging="510"/>
         <w:jc w:val="both"/>
       </w:pPr>
@@ -3443,7 +3164,7 @@
     </w:p>
     <w:p>
       <w:pPr>
-        <w:spacing w:line="360" w:lineRule="auto" w:after="400"/>
+        <w:spacing w:line="360" w:lineRule="auto" w:after="240"/>
         <w:ind w:left="510" w:hanging="510"/>
         <w:jc w:val="both"/>
       </w:pPr>
@@ -3595,121 +3316,6 @@
           <w:color w:val="FFFFFF"/>
           <w:sz w:val="36"/>
         </w:rPr>
-        <w:t>CARTA DE REMISIÓN</w:t>
-      </w:r>
-    </w:p>
-    <w:tbl>
-      <w:tblPr>
-        <w:tblW w:type="auto" w:w="0"/>
-        <w:jc w:val="center"/>
-        <w:tblLayout w:type="fixed"/>
-        <w:tblLook w:firstColumn="1" w:firstRow="1" w:lastColumn="0" w:lastRow="0" w:noHBand="0" w:noVBand="1" w:val="04A0"/>
-        <w:tblBorders>
-          <w:top w:val="single" w:sz="8" w:space="0" w:color="2E5F8A"/>
-          <w:left w:val="single" w:sz="8" w:space="0" w:color="2E5F8A"/>
-          <w:bottom w:val="single" w:sz="8" w:space="0" w:color="2E5F8A"/>
-          <w:right w:val="single" w:sz="8" w:space="0" w:color="2E5F8A"/>
-          <w:insideH w:val="single" w:sz="8" w:space="0" w:color="2E5F8A"/>
-          <w:insideV w:val="single" w:sz="8" w:space="0" w:color="2E5F8A"/>
-        </w:tblBorders>
-        <w:tblCellMar>
-          <w:top w:w="170" w:type="dxa"/>
-          <w:left w:w="170" w:type="dxa"/>
-          <w:bottom w:w="170" w:type="dxa"/>
-          <w:right w:w="170" w:type="dxa"/>
-        </w:tblCellMar>
-      </w:tblPr>
-      <w:tblGrid>
-        <w:gridCol w:w="9071"/>
-      </w:tblGrid>
-      <w:tr>
-        <w:trPr>
-          <w:trHeight w:val="10886" w:hRule="exact"/>
-        </w:trPr>
-        <w:tc>
-          <w:tcPr>
-            <w:tcW w:type="dxa" w:w="9071"/>
-            <w:vAlign w:val="center"/>
-            <w:shd w:val="clear" w:color="auto" w:fill="F2F6FA"/>
-          </w:tcPr>
-          <w:p>
-            <w:pPr>
-              <w:spacing w:line="360" w:lineRule="auto" w:after="280"/>
-              <w:jc w:val="center"/>
-            </w:pPr>
-            <w:r/>
-            <w:r>
-              <w:rPr>
-                <w:rFonts w:ascii="Arial" w:hAnsi="Arial"/>
-                <w:b/>
-                <w:color w:val="1F3864"/>
-                <w:sz w:val="24"/>
-              </w:rPr>
-              <w:t>AQUÍ VA LA CARTA DE REMISIÓN</w:t>
-            </w:r>
-          </w:p>
-          <w:p>
-            <w:pPr>
-              <w:spacing w:line="360" w:lineRule="auto" w:after="200"/>
-              <w:jc w:val="center"/>
-            </w:pPr>
-            <w:r>
-              <w:rPr>
-                <w:rFonts w:ascii="Arial" w:hAnsi="Arial"/>
-                <w:color w:val="595959"/>
-                <w:sz w:val="22"/>
-              </w:rPr>
-              <w:t>Es la carta con la que el centro educativo te remite a la empresa.</w:t>
-            </w:r>
-          </w:p>
-          <w:p>
-            <w:pPr>
-              <w:spacing w:line="360" w:lineRule="auto" w:after="200"/>
-              <w:jc w:val="center"/>
-            </w:pPr>
-            <w:r>
-              <w:rPr>
-                <w:rFonts w:ascii="Arial" w:hAnsi="Arial"/>
-                <w:color w:val="595959"/>
-                <w:sz w:val="22"/>
-              </w:rPr>
-              <w:t>La entrega el catedrático y debe ir firmada y sellada por la dirección.</w:t>
-            </w:r>
-          </w:p>
-          <w:p>
-            <w:pPr>
-              <w:spacing w:line="360" w:lineRule="auto" w:after="200"/>
-              <w:jc w:val="center"/>
-            </w:pPr>
-            <w:r>
-              <w:rPr>
-                <w:rFonts w:ascii="Arial" w:hAnsi="Arial"/>
-                <w:color w:val="595959"/>
-                <w:sz w:val="22"/>
-              </w:rPr>
-              <w:t>Escanéala y pégala aquí, ocupando toda la hoja.</w:t>
-            </w:r>
-          </w:p>
-        </w:tc>
-      </w:tr>
-    </w:tbl>
-    <w:p>
-      <w:pPr>
-        <w:pageBreakBefore/>
-        <w:pBdr>
-          <w:bottom w:val="single" w:sz="18" w:space="0" w:color="BF9B30"/>
-        </w:pBdr>
-        <w:shd w:val="clear" w:color="auto" w:fill="1F3864"/>
-        <w:spacing w:line="360" w:lineRule="auto" w:before="0" w:after="360"/>
-        <w:jc w:val="center"/>
-      </w:pPr>
-      <w:r>
-        <w:rPr>
-          <w:rFonts w:ascii="Arial" w:hAnsi="Arial"/>
-          <w:b/>
-          <w:color w:val="FFFFFF"/>
-          <w:sz w:val="36"/>
-        </w:rPr>
         <w:t>CARTA DE ACEPTACIÓN</w:t>
       </w:r>
     </w:p>
@@ -3774,7 +3380,7 @@
                 <w:color w:val="595959"/>
                 <w:sz w:val="22"/>
               </w:rPr>
-              <w:t>Es la carta en la que TOPDIC Constructora S. de R.L. hace constar que aceptó tu solicitud de práctica.</w:t>
+              <w:t>Es la carta en la que TOPDIC Constructora S. de R.L. hace constar que aceptó tu solicitud para realizar la práctica profesional.</w:t>
             </w:r>
           </w:p>
           <w:p>
@@ -3788,237 +3394,7 @@
                 <w:color w:val="595959"/>
                 <w:sz w:val="22"/>
               </w:rPr>
-              <w:t>Debe llevar los datos de la empresa, tu nombre, la carrera, el área, el periodo, y la firma y sello de Recursos Humanos.</w:t>
-            </w:r>
-          </w:p>
-          <w:p>
-            <w:pPr>
-              <w:spacing w:line="360" w:lineRule="auto" w:after="200"/>
-              <w:jc w:val="center"/>
-            </w:pPr>
-            <w:r>
-              <w:rPr>
-                <w:rFonts w:ascii="Arial" w:hAnsi="Arial"/>
-                <w:color w:val="595959"/>
-                <w:sz w:val="22"/>
-              </w:rPr>
-              <w:t>Escanéala y pégala aquí, ocupando toda la hoja.</w:t>
-            </w:r>
-          </w:p>
-        </w:tc>
-      </w:tr>
-    </w:tbl>
-    <w:p>
-      <w:pPr>
-        <w:pageBreakBefore/>
-        <w:pBdr>
-          <w:bottom w:val="single" w:sz="18" w:space="0" w:color="BF9B30"/>
-        </w:pBdr>
-        <w:shd w:val="clear" w:color="auto" w:fill="1F3864"/>
-        <w:spacing w:line="360" w:lineRule="auto" w:before="0" w:after="360"/>
-        <w:jc w:val="center"/>
-      </w:pPr>
-      <w:r>
-        <w:rPr>
-          <w:rFonts w:ascii="Arial" w:hAnsi="Arial"/>
-          <w:b/>
-          <w:color w:val="FFFFFF"/>
-          <w:sz w:val="32"/>
-        </w:rPr>
-        <w:t>SOLICITUD DE PRÁCTICA PROFESIONAL</w:t>
-      </w:r>
-    </w:p>
-    <w:tbl>
-      <w:tblPr>
-        <w:tblW w:type="auto" w:w="0"/>
-        <w:jc w:val="center"/>
-        <w:tblLayout w:type="fixed"/>
-        <w:tblLook w:firstColumn="1" w:firstRow="1" w:lastColumn="0" w:lastRow="0" w:noHBand="0" w:noVBand="1" w:val="04A0"/>
-        <w:tblBorders>
-          <w:top w:val="single" w:sz="8" w:space="0" w:color="2E5F8A"/>
-          <w:left w:val="single" w:sz="8" w:space="0" w:color="2E5F8A"/>
-          <w:bottom w:val="single" w:sz="8" w:space="0" w:color="2E5F8A"/>
-          <w:right w:val="single" w:sz="8" w:space="0" w:color="2E5F8A"/>
-          <w:insideH w:val="single" w:sz="8" w:space="0" w:color="2E5F8A"/>
-          <w:insideV w:val="single" w:sz="8" w:space="0" w:color="2E5F8A"/>
-        </w:tblBorders>
-        <w:tblCellMar>
-          <w:top w:w="170" w:type="dxa"/>
-          <w:left w:w="170" w:type="dxa"/>
-          <w:bottom w:w="170" w:type="dxa"/>
-          <w:right w:w="170" w:type="dxa"/>
-        </w:tblCellMar>
-      </w:tblPr>
-      <w:tblGrid>
-        <w:gridCol w:w="9071"/>
-      </w:tblGrid>
-      <w:tr>
-        <w:trPr>
-          <w:trHeight w:val="10886" w:hRule="exact"/>
-        </w:trPr>
-        <w:tc>
-          <w:tcPr>
-            <w:tcW w:type="dxa" w:w="9071"/>
-            <w:vAlign w:val="center"/>
-            <w:shd w:val="clear" w:color="auto" w:fill="F2F6FA"/>
-          </w:tcPr>
-          <w:p>
-            <w:pPr>
-              <w:spacing w:line="360" w:lineRule="auto" w:after="280"/>
-              <w:jc w:val="center"/>
-            </w:pPr>
-            <w:r/>
-            <w:r>
-              <w:rPr>
-                <w:rFonts w:ascii="Arial" w:hAnsi="Arial"/>
-                <w:b/>
-                <w:color w:val="1F3864"/>
-                <w:sz w:val="24"/>
-              </w:rPr>
-              <w:t>AQUÍ VA LA SOLICITUD</w:t>
-            </w:r>
-          </w:p>
-          <w:p>
-            <w:pPr>
-              <w:spacing w:line="360" w:lineRule="auto" w:after="200"/>
-              <w:jc w:val="center"/>
-            </w:pPr>
-            <w:r>
-              <w:rPr>
-                <w:rFonts w:ascii="Arial" w:hAnsi="Arial"/>
-                <w:color w:val="595959"/>
-                <w:sz w:val="22"/>
-              </w:rPr>
-              <w:t>Es la solicitud que presentaste a la empresa para pedir el espacio de práctica.</w:t>
-            </w:r>
-          </w:p>
-          <w:p>
-            <w:pPr>
-              <w:spacing w:line="360" w:lineRule="auto" w:after="200"/>
-              <w:jc w:val="center"/>
-            </w:pPr>
-            <w:r>
-              <w:rPr>
-                <w:rFonts w:ascii="Arial" w:hAnsi="Arial"/>
-                <w:color w:val="595959"/>
-                <w:sz w:val="22"/>
-              </w:rPr>
-              <w:t>La entrega el catedrático y debe llevar el sello de recibido de la empresa.</w:t>
-            </w:r>
-          </w:p>
-          <w:p>
-            <w:pPr>
-              <w:spacing w:line="360" w:lineRule="auto" w:after="200"/>
-              <w:jc w:val="center"/>
-            </w:pPr>
-            <w:r>
-              <w:rPr>
-                <w:rFonts w:ascii="Arial" w:hAnsi="Arial"/>
-                <w:color w:val="595959"/>
-                <w:sz w:val="22"/>
-              </w:rPr>
-              <w:t>Escanéala y pégala aquí, ocupando toda la hoja.</w:t>
-            </w:r>
-          </w:p>
-        </w:tc>
-      </w:tr>
-    </w:tbl>
-    <w:p>
-      <w:pPr>
-        <w:pageBreakBefore/>
-        <w:pBdr>
-          <w:bottom w:val="single" w:sz="18" w:space="0" w:color="BF9B30"/>
-        </w:pBdr>
-        <w:shd w:val="clear" w:color="auto" w:fill="1F3864"/>
-        <w:spacing w:line="360" w:lineRule="auto" w:before="0" w:after="360"/>
-        <w:jc w:val="center"/>
-      </w:pPr>
-      <w:r>
-        <w:rPr>
-          <w:rFonts w:ascii="Arial" w:hAnsi="Arial"/>
-          <w:b/>
-          <w:color w:val="FFFFFF"/>
-          <w:sz w:val="36"/>
-        </w:rPr>
-        <w:t>CREDENCIAL</w:t>
-      </w:r>
-    </w:p>
-    <w:tbl>
-      <w:tblPr>
-        <w:tblW w:type="auto" w:w="0"/>
-        <w:jc w:val="center"/>
-        <w:tblLayout w:type="fixed"/>
-        <w:tblLook w:firstColumn="1" w:firstRow="1" w:lastColumn="0" w:lastRow="0" w:noHBand="0" w:noVBand="1" w:val="04A0"/>
-        <w:tblBorders>
-          <w:top w:val="single" w:sz="8" w:space="0" w:color="2E5F8A"/>
-          <w:left w:val="single" w:sz="8" w:space="0" w:color="2E5F8A"/>
-          <w:bottom w:val="single" w:sz="8" w:space="0" w:color="2E5F8A"/>
-          <w:right w:val="single" w:sz="8" w:space="0" w:color="2E5F8A"/>
-          <w:insideH w:val="single" w:sz="8" w:space="0" w:color="2E5F8A"/>
-          <w:insideV w:val="single" w:sz="8" w:space="0" w:color="2E5F8A"/>
-        </w:tblBorders>
-        <w:tblCellMar>
-          <w:top w:w="170" w:type="dxa"/>
-          <w:left w:w="170" w:type="dxa"/>
-          <w:bottom w:w="170" w:type="dxa"/>
-          <w:right w:w="170" w:type="dxa"/>
-        </w:tblCellMar>
-      </w:tblPr>
-      <w:tblGrid>
-        <w:gridCol w:w="9071"/>
-      </w:tblGrid>
-      <w:tr>
-        <w:trPr>
-          <w:trHeight w:val="10886" w:hRule="exact"/>
-        </w:trPr>
-        <w:tc>
-          <w:tcPr>
-            <w:tcW w:type="dxa" w:w="9071"/>
-            <w:vAlign w:val="center"/>
-            <w:shd w:val="clear" w:color="auto" w:fill="F2F6FA"/>
-          </w:tcPr>
-          <w:p>
-            <w:pPr>
-              <w:spacing w:line="360" w:lineRule="auto" w:after="280"/>
-              <w:jc w:val="center"/>
-            </w:pPr>
-            <w:r/>
-            <w:r>
-              <w:rPr>
-                <w:rFonts w:ascii="Arial" w:hAnsi="Arial"/>
-                <w:b/>
-                <w:color w:val="1F3864"/>
-                <w:sz w:val="24"/>
-              </w:rPr>
-              <w:t>AQUÍ VA LA CREDENCIAL</w:t>
-            </w:r>
-          </w:p>
-          <w:p>
-            <w:pPr>
-              <w:spacing w:line="360" w:lineRule="auto" w:after="200"/>
-              <w:jc w:val="center"/>
-            </w:pPr>
-            <w:r>
-              <w:rPr>
-                <w:rFonts w:ascii="Arial" w:hAnsi="Arial"/>
-                <w:color w:val="595959"/>
-                <w:sz w:val="22"/>
-              </w:rPr>
-              <w:t>Es el documento con el que el director del centro educativo te acredita para realizar la práctica.</w:t>
-            </w:r>
-          </w:p>
-          <w:p>
-            <w:pPr>
-              <w:spacing w:line="360" w:lineRule="auto" w:after="200"/>
-              <w:jc w:val="center"/>
-            </w:pPr>
-            <w:r>
-              <w:rPr>
-                <w:rFonts w:ascii="Arial" w:hAnsi="Arial"/>
-                <w:color w:val="595959"/>
-                <w:sz w:val="22"/>
-              </w:rPr>
-              <w:t>Debe llevar tu nombre, la carrera, las fechas, y la firma y sello del director.</w:t>
+              <w:t>Debe llevar la firma y el sello de la empresa.</w:t>
             </w:r>
           </w:p>
           <w:p>
@@ -4106,7 +3482,7 @@
       </w:tblGrid>
       <w:tr>
         <w:trPr>
-          <w:trHeight w:val="481" w:hRule="exact"/>
+          <w:trHeight w:val="453" w:hRule="exact"/>
         </w:trPr>
         <w:tc>
           <w:tcPr>
@@ -4272,7 +3648,7 @@
       </w:tr>
       <w:tr>
         <w:trPr>
-          <w:trHeight w:val="385" w:hRule="exact"/>
+          <w:trHeight w:val="351" w:hRule="exact"/>
         </w:trPr>
         <w:tc>
           <w:tcPr>
@@ -4301,7 +3677,7 @@
       </w:tr>
       <w:tr>
         <w:trPr>
-          <w:trHeight w:val="385" w:hRule="exact"/>
+          <w:trHeight w:val="351" w:hRule="exact"/>
         </w:trPr>
         <w:tc>
           <w:tcPr>
@@ -4458,7 +3834,7 @@
       </w:tr>
       <w:tr>
         <w:trPr>
-          <w:trHeight w:val="385" w:hRule="exact"/>
+          <w:trHeight w:val="351" w:hRule="exact"/>
         </w:trPr>
         <w:tc>
           <w:tcPr>
@@ -4615,7 +3991,7 @@
       </w:tr>
       <w:tr>
         <w:trPr>
-          <w:trHeight w:val="385" w:hRule="exact"/>
+          <w:trHeight w:val="351" w:hRule="exact"/>
         </w:trPr>
         <w:tc>
           <w:tcPr>
@@ -4772,7 +4148,7 @@
       </w:tr>
       <w:tr>
         <w:trPr>
-          <w:trHeight w:val="385" w:hRule="exact"/>
+          <w:trHeight w:val="351" w:hRule="exact"/>
         </w:trPr>
         <w:tc>
           <w:tcPr>
@@ -4929,7 +4305,7 @@
       </w:tr>
       <w:tr>
         <w:trPr>
-          <w:trHeight w:val="385" w:hRule="exact"/>
+          <w:trHeight w:val="351" w:hRule="exact"/>
         </w:trPr>
         <w:tc>
           <w:tcPr>
@@ -5086,7 +4462,7 @@
       </w:tr>
       <w:tr>
         <w:trPr>
-          <w:trHeight w:val="385" w:hRule="exact"/>
+          <w:trHeight w:val="351" w:hRule="exact"/>
         </w:trPr>
         <w:tc>
           <w:tcPr>
@@ -5115,7 +4491,7 @@
       </w:tr>
       <w:tr>
         <w:trPr>
-          <w:trHeight w:val="385" w:hRule="exact"/>
+          <w:trHeight w:val="351" w:hRule="exact"/>
         </w:trPr>
         <w:tc>
           <w:tcPr>
@@ -5272,7 +4648,7 @@
       </w:tr>
       <w:tr>
         <w:trPr>
-          <w:trHeight w:val="385" w:hRule="exact"/>
+          <w:trHeight w:val="351" w:hRule="exact"/>
         </w:trPr>
         <w:tc>
           <w:tcPr>
@@ -5429,7 +4805,7 @@
       </w:tr>
       <w:tr>
         <w:trPr>
-          <w:trHeight w:val="385" w:hRule="exact"/>
+          <w:trHeight w:val="351" w:hRule="exact"/>
         </w:trPr>
         <w:tc>
           <w:tcPr>
@@ -5586,7 +4962,7 @@
       </w:tr>
       <w:tr>
         <w:trPr>
-          <w:trHeight w:val="385" w:hRule="exact"/>
+          <w:trHeight w:val="351" w:hRule="exact"/>
         </w:trPr>
         <w:tc>
           <w:tcPr>
@@ -5743,7 +5119,7 @@
       </w:tr>
       <w:tr>
         <w:trPr>
-          <w:trHeight w:val="385" w:hRule="exact"/>
+          <w:trHeight w:val="351" w:hRule="exact"/>
         </w:trPr>
         <w:tc>
           <w:tcPr>
@@ -5900,7 +5276,7 @@
       </w:tr>
       <w:tr>
         <w:trPr>
-          <w:trHeight w:val="385" w:hRule="exact"/>
+          <w:trHeight w:val="351" w:hRule="exact"/>
         </w:trPr>
         <w:tc>
           <w:tcPr>
@@ -5929,7 +5305,7 @@
       </w:tr>
       <w:tr>
         <w:trPr>
-          <w:trHeight w:val="385" w:hRule="exact"/>
+          <w:trHeight w:val="351" w:hRule="exact"/>
         </w:trPr>
         <w:tc>
           <w:tcPr>
@@ -6086,7 +5462,7 @@
       </w:tr>
       <w:tr>
         <w:trPr>
-          <w:trHeight w:val="385" w:hRule="exact"/>
+          <w:trHeight w:val="351" w:hRule="exact"/>
         </w:trPr>
         <w:tc>
           <w:tcPr>
@@ -6243,7 +5619,7 @@
       </w:tr>
       <w:tr>
         <w:trPr>
-          <w:trHeight w:val="385" w:hRule="exact"/>
+          <w:trHeight w:val="351" w:hRule="exact"/>
         </w:trPr>
         <w:tc>
           <w:tcPr>
@@ -6400,7 +5776,7 @@
       </w:tr>
       <w:tr>
         <w:trPr>
-          <w:trHeight w:val="385" w:hRule="exact"/>
+          <w:trHeight w:val="351" w:hRule="exact"/>
         </w:trPr>
         <w:tc>
           <w:tcPr>
@@ -6557,7 +5933,7 @@
       </w:tr>
       <w:tr>
         <w:trPr>
-          <w:trHeight w:val="385" w:hRule="exact"/>
+          <w:trHeight w:val="351" w:hRule="exact"/>
         </w:trPr>
         <w:tc>
           <w:tcPr>
@@ -6714,7 +6090,7 @@
       </w:tr>
       <w:tr>
         <w:trPr>
-          <w:trHeight w:val="385" w:hRule="exact"/>
+          <w:trHeight w:val="351" w:hRule="exact"/>
         </w:trPr>
         <w:tc>
           <w:tcPr>
@@ -6743,7 +6119,7 @@
       </w:tr>
       <w:tr>
         <w:trPr>
-          <w:trHeight w:val="385" w:hRule="exact"/>
+          <w:trHeight w:val="351" w:hRule="exact"/>
         </w:trPr>
         <w:tc>
           <w:tcPr>
@@ -6900,7 +6276,7 @@
       </w:tr>
       <w:tr>
         <w:trPr>
-          <w:trHeight w:val="385" w:hRule="exact"/>
+          <w:trHeight w:val="351" w:hRule="exact"/>
         </w:trPr>
         <w:tc>
           <w:tcPr>
@@ -7057,7 +6433,7 @@
       </w:tr>
       <w:tr>
         <w:trPr>
-          <w:trHeight w:val="385" w:hRule="exact"/>
+          <w:trHeight w:val="351" w:hRule="exact"/>
         </w:trPr>
         <w:tc>
           <w:tcPr>
@@ -7214,7 +6590,7 @@
       </w:tr>
       <w:tr>
         <w:trPr>
-          <w:trHeight w:val="385" w:hRule="exact"/>
+          <w:trHeight w:val="351" w:hRule="exact"/>
         </w:trPr>
         <w:tc>
           <w:tcPr>
@@ -7371,7 +6747,7 @@
       </w:tr>
       <w:tr>
         <w:trPr>
-          <w:trHeight w:val="385" w:hRule="exact"/>
+          <w:trHeight w:val="351" w:hRule="exact"/>
         </w:trPr>
         <w:tc>
           <w:tcPr>
@@ -7528,7 +6904,7 @@
       </w:tr>
       <w:tr>
         <w:trPr>
-          <w:trHeight w:val="385" w:hRule="exact"/>
+          <w:trHeight w:val="351" w:hRule="exact"/>
         </w:trPr>
         <w:tc>
           <w:tcPr>
@@ -7557,7 +6933,7 @@
       </w:tr>
       <w:tr>
         <w:trPr>
-          <w:trHeight w:val="385" w:hRule="exact"/>
+          <w:trHeight w:val="351" w:hRule="exact"/>
         </w:trPr>
         <w:tc>
           <w:tcPr>
@@ -7712,7 +7088,76 @@
           </w:p>
         </w:tc>
       </w:tr>
+      <w:tr>
+        <w:trPr>
+          <w:trHeight w:val="396" w:hRule="exact"/>
+        </w:trPr>
+        <w:tc>
+          <w:tcPr>
+            <w:tcW w:type="dxa" w:w="5216"/>
+            <w:gridSpan w:val="4"/>
+            <w:vAlign w:val="center"/>
+            <w:shd w:val="clear" w:color="auto" w:fill="2E5F8A"/>
+          </w:tcPr>
+          <w:p>
+            <w:pPr>
+              <w:spacing w:line="240" w:lineRule="auto" w:after="0" w:before="0"/>
+              <w:jc w:val="center"/>
+            </w:pPr>
+            <w:r/>
+            <w:r>
+              <w:rPr>
+                <w:rFonts w:ascii="Arial" w:hAnsi="Arial"/>
+                <w:b/>
+                <w:color w:val="FFFFFF"/>
+                <w:sz w:val="18"/>
+              </w:rPr>
+              <w:t>TOTAL DE DÍAS ASISTIDOS</w:t>
+            </w:r>
+          </w:p>
+        </w:tc>
+        <w:tc>
+          <w:tcPr>
+            <w:tcW w:type="dxa" w:w="3288"/>
+            <w:gridSpan w:val="3"/>
+            <w:vAlign w:val="center"/>
+            <w:shd w:val="clear" w:color="auto" w:fill="E4ECF5"/>
+          </w:tcPr>
+          <w:p>
+            <w:pPr>
+              <w:spacing w:line="240" w:lineRule="auto" w:after="0" w:before="0"/>
+              <w:jc w:val="center"/>
+            </w:pPr>
+            <w:r/>
+            <w:r>
+              <w:rPr>
+                <w:rFonts w:ascii="Arial" w:hAnsi="Arial"/>
+                <w:b/>
+                <w:color w:val="1F3864"/>
+                <w:sz w:val="18"/>
+              </w:rPr>
+              <w:t>21 días</w:t>
+            </w:r>
+          </w:p>
+        </w:tc>
+      </w:tr>
     </w:tbl>
+    <w:p>
+      <w:pPr>
+        <w:spacing w:line="240" w:lineRule="auto" w:before="160" w:after="0"/>
+        <w:jc w:val="left"/>
+      </w:pPr>
+      <w:r>
+        <w:rPr>
+          <w:rFonts w:ascii="Arial" w:hAnsi="Arial"/>
+          <w:b w:val="0"/>
+          <w:i w:val="0"/>
+          <w:color w:val="595959"/>
+          <w:sz w:val="18"/>
+        </w:rPr>
+        <w:t>Nota: la empresa no laboraba sábados ni domingos, por lo que esos días no se incluyen en el cuadro.</w:t>
+      </w:r>
+    </w:p>
     <w:p>
       <w:pPr>
         <w:pageBreakBefore/>
@@ -8394,439 +7839,7 @@
           <w:color w:val="595959"/>
           <w:sz w:val="24"/>
         </w:rPr>
-        <w:t>Semana 4</w:t>
-      </w:r>
-    </w:p>
-    <w:tbl>
-      <w:tblPr>
-        <w:tblW w:type="auto" w:w="0"/>
-        <w:jc w:val="center"/>
-        <w:tblLayout w:type="fixed"/>
-        <w:tblLook w:firstColumn="1" w:firstRow="1" w:lastColumn="0" w:lastRow="0" w:noHBand="0" w:noVBand="1" w:val="04A0"/>
-        <w:tblBorders>
-          <w:top w:val="single" w:sz="6" w:space="0" w:color="2E5F8A"/>
-          <w:left w:val="single" w:sz="6" w:space="0" w:color="2E5F8A"/>
-          <w:bottom w:val="single" w:sz="6" w:space="0" w:color="2E5F8A"/>
-          <w:right w:val="single" w:sz="6" w:space="0" w:color="2E5F8A"/>
-          <w:insideH w:val="single" w:sz="6" w:space="0" w:color="2E5F8A"/>
-          <w:insideV w:val="single" w:sz="6" w:space="0" w:color="2E5F8A"/>
-        </w:tblBorders>
-        <w:tblCellMar>
-          <w:top w:w="80" w:type="dxa"/>
-          <w:left w:w="80" w:type="dxa"/>
-          <w:bottom w:w="80" w:type="dxa"/>
-          <w:right w:w="80" w:type="dxa"/>
-        </w:tblCellMar>
-      </w:tblPr>
-      <w:tblGrid>
-        <w:gridCol w:w="4535"/>
-        <w:gridCol w:w="4535"/>
-      </w:tblGrid>
-      <w:tr>
-        <w:trPr>
-          <w:trHeight w:val="5159" w:hRule="exact"/>
-        </w:trPr>
-        <w:tc>
-          <w:tcPr>
-            <w:tcW w:type="dxa" w:w="4535"/>
-            <w:vAlign w:val="center"/>
-            <w:shd w:val="clear" w:color="auto" w:fill="F2F6FA"/>
-          </w:tcPr>
-          <w:p>
-            <w:pPr>
-              <w:spacing w:line="360" w:lineRule="auto" w:after="80"/>
-              <w:jc w:val="center"/>
-            </w:pPr>
-            <w:r>
-              <w:rPr>
-                <w:rFonts w:ascii="Arial" w:hAnsi="Arial"/>
-                <w:b/>
-                <w:color w:val="1F3864"/>
-                <w:sz w:val="22"/>
-              </w:rPr>
-              <w:t>Hoja de bitácora 1</w:t>
-            </w:r>
-          </w:p>
-          <w:p>
-            <w:pPr>
-              <w:spacing w:line="240" w:lineRule="auto"/>
-              <w:jc w:val="center"/>
-            </w:pPr>
-            <w:r>
-              <w:rPr>
-                <w:rFonts w:ascii="Arial" w:hAnsi="Arial"/>
-                <w:color w:val="8C8C8C"/>
-                <w:sz w:val="18"/>
-              </w:rPr>
-              <w:t>Pega aquí la imagen escaneada</w:t>
-            </w:r>
-          </w:p>
-        </w:tc>
-        <w:tc>
-          <w:tcPr>
-            <w:tcW w:type="dxa" w:w="4535"/>
-            <w:vAlign w:val="center"/>
-            <w:shd w:val="clear" w:color="auto" w:fill="F2F6FA"/>
-          </w:tcPr>
-          <w:p>
-            <w:pPr>
-              <w:spacing w:line="360" w:lineRule="auto" w:after="80"/>
-              <w:jc w:val="center"/>
-            </w:pPr>
-            <w:r>
-              <w:rPr>
-                <w:rFonts w:ascii="Arial" w:hAnsi="Arial"/>
-                <w:b/>
-                <w:color w:val="1F3864"/>
-                <w:sz w:val="22"/>
-              </w:rPr>
-              <w:t>Hoja de bitácora 2</w:t>
-            </w:r>
-          </w:p>
-          <w:p>
-            <w:pPr>
-              <w:spacing w:line="240" w:lineRule="auto"/>
-              <w:jc w:val="center"/>
-            </w:pPr>
-            <w:r>
-              <w:rPr>
-                <w:rFonts w:ascii="Arial" w:hAnsi="Arial"/>
-                <w:color w:val="8C8C8C"/>
-                <w:sz w:val="18"/>
-              </w:rPr>
-              <w:t>Pega aquí la imagen escaneada</w:t>
-            </w:r>
-          </w:p>
-        </w:tc>
-      </w:tr>
-      <w:tr>
-        <w:trPr>
-          <w:trHeight w:val="5159" w:hRule="exact"/>
-        </w:trPr>
-        <w:tc>
-          <w:tcPr>
-            <w:tcW w:type="dxa" w:w="4535"/>
-            <w:vAlign w:val="center"/>
-            <w:shd w:val="clear" w:color="auto" w:fill="F2F6FA"/>
-          </w:tcPr>
-          <w:p>
-            <w:pPr>
-              <w:spacing w:line="360" w:lineRule="auto" w:after="80"/>
-              <w:jc w:val="center"/>
-            </w:pPr>
-            <w:r>
-              <w:rPr>
-                <w:rFonts w:ascii="Arial" w:hAnsi="Arial"/>
-                <w:b/>
-                <w:color w:val="1F3864"/>
-                <w:sz w:val="22"/>
-              </w:rPr>
-              <w:t>Hoja de bitácora 3</w:t>
-            </w:r>
-          </w:p>
-          <w:p>
-            <w:pPr>
-              <w:spacing w:line="240" w:lineRule="auto"/>
-              <w:jc w:val="center"/>
-            </w:pPr>
-            <w:r>
-              <w:rPr>
-                <w:rFonts w:ascii="Arial" w:hAnsi="Arial"/>
-                <w:color w:val="8C8C8C"/>
-                <w:sz w:val="18"/>
-              </w:rPr>
-              <w:t>Pega aquí la imagen escaneada</w:t>
-            </w:r>
-          </w:p>
-        </w:tc>
-        <w:tc>
-          <w:tcPr>
-            <w:tcW w:type="dxa" w:w="4535"/>
-            <w:vAlign w:val="center"/>
-            <w:shd w:val="clear" w:color="auto" w:fill="F2F6FA"/>
-          </w:tcPr>
-          <w:p>
-            <w:pPr>
-              <w:spacing w:line="360" w:lineRule="auto" w:after="80"/>
-              <w:jc w:val="center"/>
-            </w:pPr>
-            <w:r>
-              <w:rPr>
-                <w:rFonts w:ascii="Arial" w:hAnsi="Arial"/>
-                <w:b/>
-                <w:color w:val="1F3864"/>
-                <w:sz w:val="22"/>
-              </w:rPr>
-              <w:t>Hoja de bitácora 4</w:t>
-            </w:r>
-          </w:p>
-          <w:p>
-            <w:pPr>
-              <w:spacing w:line="240" w:lineRule="auto"/>
-              <w:jc w:val="center"/>
-            </w:pPr>
-            <w:r>
-              <w:rPr>
-                <w:rFonts w:ascii="Arial" w:hAnsi="Arial"/>
-                <w:color w:val="8C8C8C"/>
-                <w:sz w:val="18"/>
-              </w:rPr>
-              <w:t>Pega aquí la imagen escaneada</w:t>
-            </w:r>
-          </w:p>
-        </w:tc>
-      </w:tr>
-    </w:tbl>
-    <w:p>
-      <w:pPr>
-        <w:pageBreakBefore/>
-        <w:pBdr>
-          <w:bottom w:val="single" w:sz="18" w:space="0" w:color="BF9B30"/>
-        </w:pBdr>
-        <w:shd w:val="clear" w:color="auto" w:fill="1F3864"/>
-        <w:spacing w:line="360" w:lineRule="auto" w:before="0" w:after="160"/>
-        <w:jc w:val="center"/>
-      </w:pPr>
-      <w:r>
-        <w:rPr>
-          <w:rFonts w:ascii="Arial" w:hAnsi="Arial"/>
-          <w:b/>
-          <w:color w:val="FFFFFF"/>
-          <w:sz w:val="36"/>
-        </w:rPr>
-        <w:t>BITÁCORA</w:t>
-      </w:r>
-    </w:p>
-    <w:p>
-      <w:pPr>
-        <w:spacing w:line="240" w:lineRule="auto" w:before="0" w:after="240"/>
-        <w:jc w:val="center"/>
-      </w:pPr>
-      <w:r>
-        <w:rPr>
-          <w:rFonts w:ascii="Arial" w:hAnsi="Arial"/>
-          <w:b/>
-          <w:i w:val="0"/>
-          <w:color w:val="595959"/>
-          <w:sz w:val="24"/>
-        </w:rPr>
-        <w:t>Semana 5</w:t>
-      </w:r>
-    </w:p>
-    <w:tbl>
-      <w:tblPr>
-        <w:tblW w:type="auto" w:w="0"/>
-        <w:jc w:val="center"/>
-        <w:tblLayout w:type="fixed"/>
-        <w:tblLook w:firstColumn="1" w:firstRow="1" w:lastColumn="0" w:lastRow="0" w:noHBand="0" w:noVBand="1" w:val="04A0"/>
-        <w:tblBorders>
-          <w:top w:val="single" w:sz="6" w:space="0" w:color="2E5F8A"/>
-          <w:left w:val="single" w:sz="6" w:space="0" w:color="2E5F8A"/>
-          <w:bottom w:val="single" w:sz="6" w:space="0" w:color="2E5F8A"/>
-          <w:right w:val="single" w:sz="6" w:space="0" w:color="2E5F8A"/>
-          <w:insideH w:val="single" w:sz="6" w:space="0" w:color="2E5F8A"/>
-          <w:insideV w:val="single" w:sz="6" w:space="0" w:color="2E5F8A"/>
-        </w:tblBorders>
-        <w:tblCellMar>
-          <w:top w:w="80" w:type="dxa"/>
-          <w:left w:w="80" w:type="dxa"/>
-          <w:bottom w:w="80" w:type="dxa"/>
-          <w:right w:w="80" w:type="dxa"/>
-        </w:tblCellMar>
-      </w:tblPr>
-      <w:tblGrid>
-        <w:gridCol w:w="4535"/>
-        <w:gridCol w:w="4535"/>
-      </w:tblGrid>
-      <w:tr>
-        <w:trPr>
-          <w:trHeight w:val="5159" w:hRule="exact"/>
-        </w:trPr>
-        <w:tc>
-          <w:tcPr>
-            <w:tcW w:type="dxa" w:w="4535"/>
-            <w:vAlign w:val="center"/>
-            <w:shd w:val="clear" w:color="auto" w:fill="F2F6FA"/>
-          </w:tcPr>
-          <w:p>
-            <w:pPr>
-              <w:spacing w:line="360" w:lineRule="auto" w:after="80"/>
-              <w:jc w:val="center"/>
-            </w:pPr>
-            <w:r>
-              <w:rPr>
-                <w:rFonts w:ascii="Arial" w:hAnsi="Arial"/>
-                <w:b/>
-                <w:color w:val="1F3864"/>
-                <w:sz w:val="22"/>
-              </w:rPr>
-              <w:t>Hoja de bitácora 1</w:t>
-            </w:r>
-          </w:p>
-          <w:p>
-            <w:pPr>
-              <w:spacing w:line="240" w:lineRule="auto"/>
-              <w:jc w:val="center"/>
-            </w:pPr>
-            <w:r>
-              <w:rPr>
-                <w:rFonts w:ascii="Arial" w:hAnsi="Arial"/>
-                <w:color w:val="8C8C8C"/>
-                <w:sz w:val="18"/>
-              </w:rPr>
-              <w:t>Pega aquí la imagen escaneada</w:t>
-            </w:r>
-          </w:p>
-        </w:tc>
-        <w:tc>
-          <w:tcPr>
-            <w:tcW w:type="dxa" w:w="4535"/>
-            <w:vAlign w:val="center"/>
-            <w:shd w:val="clear" w:color="auto" w:fill="F2F6FA"/>
-          </w:tcPr>
-          <w:p>
-            <w:pPr>
-              <w:spacing w:line="360" w:lineRule="auto" w:after="80"/>
-              <w:jc w:val="center"/>
-            </w:pPr>
-            <w:r>
-              <w:rPr>
-                <w:rFonts w:ascii="Arial" w:hAnsi="Arial"/>
-                <w:b/>
-                <w:color w:val="1F3864"/>
-                <w:sz w:val="22"/>
-              </w:rPr>
-              <w:t>Hoja de bitácora 2</w:t>
-            </w:r>
-          </w:p>
-          <w:p>
-            <w:pPr>
-              <w:spacing w:line="240" w:lineRule="auto"/>
-              <w:jc w:val="center"/>
-            </w:pPr>
-            <w:r>
-              <w:rPr>
-                <w:rFonts w:ascii="Arial" w:hAnsi="Arial"/>
-                <w:color w:val="8C8C8C"/>
-                <w:sz w:val="18"/>
-              </w:rPr>
-              <w:t>Pega aquí la imagen escaneada</w:t>
-            </w:r>
-          </w:p>
-        </w:tc>
-      </w:tr>
-      <w:tr>
-        <w:trPr>
-          <w:trHeight w:val="5159" w:hRule="exact"/>
-        </w:trPr>
-        <w:tc>
-          <w:tcPr>
-            <w:tcW w:type="dxa" w:w="4535"/>
-            <w:vAlign w:val="center"/>
-            <w:shd w:val="clear" w:color="auto" w:fill="F2F6FA"/>
-          </w:tcPr>
-          <w:p>
-            <w:pPr>
-              <w:spacing w:line="360" w:lineRule="auto" w:after="80"/>
-              <w:jc w:val="center"/>
-            </w:pPr>
-            <w:r>
-              <w:rPr>
-                <w:rFonts w:ascii="Arial" w:hAnsi="Arial"/>
-                <w:b/>
-                <w:color w:val="1F3864"/>
-                <w:sz w:val="22"/>
-              </w:rPr>
-              <w:t>Hoja de bitácora 3</w:t>
-            </w:r>
-          </w:p>
-          <w:p>
-            <w:pPr>
-              <w:spacing w:line="240" w:lineRule="auto"/>
-              <w:jc w:val="center"/>
-            </w:pPr>
-            <w:r>
-              <w:rPr>
-                <w:rFonts w:ascii="Arial" w:hAnsi="Arial"/>
-                <w:color w:val="8C8C8C"/>
-                <w:sz w:val="18"/>
-              </w:rPr>
-              <w:t>Pega aquí la imagen escaneada</w:t>
-            </w:r>
-          </w:p>
-        </w:tc>
-        <w:tc>
-          <w:tcPr>
-            <w:tcW w:type="dxa" w:w="4535"/>
-            <w:vAlign w:val="center"/>
-            <w:shd w:val="clear" w:color="auto" w:fill="F2F6FA"/>
-          </w:tcPr>
-          <w:p>
-            <w:pPr>
-              <w:spacing w:line="360" w:lineRule="auto" w:after="80"/>
-              <w:jc w:val="center"/>
-            </w:pPr>
-            <w:r>
-              <w:rPr>
-                <w:rFonts w:ascii="Arial" w:hAnsi="Arial"/>
-                <w:b/>
-                <w:color w:val="1F3864"/>
-                <w:sz w:val="22"/>
-              </w:rPr>
-              <w:t>Hoja de bitácora 4</w:t>
-            </w:r>
-          </w:p>
-          <w:p>
-            <w:pPr>
-              <w:spacing w:line="240" w:lineRule="auto"/>
-              <w:jc w:val="center"/>
-            </w:pPr>
-            <w:r>
-              <w:rPr>
-                <w:rFonts w:ascii="Arial" w:hAnsi="Arial"/>
-                <w:color w:val="8C8C8C"/>
-                <w:sz w:val="18"/>
-              </w:rPr>
-              <w:t>Pega aquí la imagen escaneada</w:t>
-            </w:r>
-          </w:p>
-        </w:tc>
-      </w:tr>
-    </w:tbl>
-    <w:p>
-      <w:pPr>
-        <w:pageBreakBefore/>
-        <w:pBdr>
-          <w:bottom w:val="single" w:sz="18" w:space="0" w:color="BF9B30"/>
-        </w:pBdr>
-        <w:shd w:val="clear" w:color="auto" w:fill="1F3864"/>
-        <w:spacing w:line="360" w:lineRule="auto" w:before="0" w:after="160"/>
-        <w:jc w:val="center"/>
-      </w:pPr>
-      <w:r>
-        <w:rPr>
-          <w:rFonts w:ascii="Arial" w:hAnsi="Arial"/>
-          <w:b/>
-          <w:color w:val="FFFFFF"/>
-          <w:sz w:val="36"/>
-        </w:rPr>
-        <w:t>BITÁCORA</w:t>
-      </w:r>
-    </w:p>
-    <w:p>
-      <w:pPr>
-        <w:spacing w:line="240" w:lineRule="auto" w:before="0" w:after="240"/>
-        <w:jc w:val="center"/>
-      </w:pPr>
-      <w:r>
-        <w:rPr>
-          <w:rFonts w:ascii="Arial" w:hAnsi="Arial"/>
-          <w:b/>
-          <w:i w:val="0"/>
-          <w:color w:val="595959"/>
-          <w:sz w:val="24"/>
-        </w:rPr>
-        <w:t>Hojas restantes</w:t>
+        <w:t>Semanas 4 y 5</w:t>
       </w:r>
     </w:p>
     <w:tbl>
@@ -9592,7 +8605,7 @@
                 <w:color w:val="1F3864"/>
                 <w:sz w:val="24"/>
               </w:rPr>
-              <w:t>AQUÍ VA EL FLUJOGRAMA DE LAS ACTIVIDADES</w:t>
+              <w:t>AQUÍ VA EL FLUJOGRAMA DE LA EMPRESA</w:t>
             </w:r>
           </w:p>
           <w:p>
@@ -9606,7 +8619,7 @@
                 <w:color w:val="595959"/>
                 <w:sz w:val="22"/>
               </w:rPr>
-              <w:t>Dibuja el proceso de las actividades que te asignaron en el área contable.</w:t>
+              <w:t>Pega aquí el flujograma con el proceso de las actividades que te asignaron en el Departamento de Contabilidad.</w:t>
             </w:r>
           </w:p>
           <w:p>
@@ -9620,31 +8633,16 @@
                 <w:color w:val="595959"/>
                 <w:sz w:val="22"/>
               </w:rPr>
-              <w:t>Puede seguir este orden: recepción de la factura → revisión de los datos → registro en VisionWin → elaboración de la partida → revisión del balance → archivo del documento → declaración ante el SAR.</w:t>
-            </w:r>
-          </w:p>
-          <w:p>
-            <w:pPr>
-              <w:spacing w:line="360" w:lineRule="auto" w:after="200"/>
-              <w:jc w:val="center"/>
-            </w:pPr>
-            <w:r>
-              <w:rPr>
-                <w:rFonts w:ascii="Arial" w:hAnsi="Arial"/>
-                <w:color w:val="595959"/>
-                <w:sz w:val="22"/>
-              </w:rPr>
-              <w:t>Podés hacerlo con Insertar → Formas o con SmartArt.</w:t>
+              <w:t>Debe ocupar toda la hoja.</w:t>
             </w:r>
           </w:p>
         </w:tc>
       </w:tr>
     </w:tbl>
     <w:sectPr>
-      <w:headerReference w:type="default" r:id="rId9"/>
-      <w:footerReference w:type="default" r:id="rId10"/>
+      <w:footerReference w:type="default" r:id="rId9"/>
       <w:pgSz w:w="11906" w:h="16838"/>
-      <w:pgMar w:top="1474" w:right="1417" w:bottom="1474" w:left="1417" w:header="765" w:footer="765" w:gutter="0"/>
+      <w:pgMar w:top="1474" w:right="1417" w:bottom="1474" w:left="1417" w:header="765" w:footer="794" w:gutter="0"/>
       <w:cols w:space="720"/>
       <w:titlePg/>
       <w:docGrid w:linePitch="360"/>
@@ -9664,21 +8662,9 @@
   <w:p>
     <w:pPr>
       <w:pStyle w:val="Footer"/>
-      <w:tabs>
-        <w:tab w:pos="9071" w:val="right"/>
-      </w:tabs>
-      <w:spacing w:before="0" w:line="240" w:lineRule="auto"/>
-      <w:jc w:val="left"/>
+      <w:spacing w:before="0" w:after="0" w:line="240" w:lineRule="auto"/>
+      <w:jc w:val="center"/>
     </w:pPr>
-    <w:r>
-      <w:rPr>
-        <w:rFonts w:ascii="Arial" w:hAnsi="Arial"/>
-        <w:color w:val="8C8C8C"/>
-        <w:sz w:val="18"/>
-      </w:rPr>
-      <w:t>Informe de Práctica Profesional</w:t>
-      <w:tab/>
-    </w:r>
     <w:r>
       <w:rPr>
         <w:rFonts w:ascii="Arial" w:hAnsi="Arial"/>
@@ -9692,29 +8678,6 @@
     </w:r>
   </w:p>
 </w:ftr>
-</file>
-
-<file path=word/header1.xml><?xml version="1.0" encoding="utf-8"?>
-<w:hdr xmlns:m="http://schemas.openxmlformats.org/officeDocument/2006/math" xmlns:mc="http://schemas.openxmlformats.org/markup-compatibility/2006" xmlns:mo="http://schemas.microsoft.com/office/mac/office/2008/main" xmlns:mv="urn:schemas-microsoft-com:mac:vml" xmlns:o="urn:schemas-microsoft-com:office:office" xmlns:r="http://schemas.openxmlformats.org/officeDocument/2006/relationships" xmlns:v="urn:schemas-microsoft-com:vml" xmlns:w10="urn:schemas-microsoft-com:office:word" xmlns:w14="http://schemas.microsoft.com/office/word/2010/wordml" xmlns:w="http://schemas.openxmlformats.org/wordprocessingml/2006/main" xmlns:wne="http://schemas.microsoft.com/office/word/2006/wordml" xmlns:wp14="http://schemas.microsoft.com/office/word/2010/wordprocessingDrawing" xmlns:wp="http://schemas.openxmlformats.org/drawingml/2006/wordprocessingDrawing" xmlns:wpc="http://schemas.microsoft.com/office/word/2010/wordprocessingCanvas" xmlns:wpg="http://schemas.microsoft.com/office/word/2010/wordprocessingGroup" xmlns:wpi="http://schemas.microsoft.com/office/word/2010/wordprocessingInk" xmlns:wps="http://schemas.microsoft.com/office/word/2010/wordprocessingShape" mc:Ignorable="w14 wp14">
-  <w:p>
-    <w:pPr>
-      <w:pStyle w:val="Header"/>
-      <w:pBdr>
-        <w:bottom w:val="single" w:sz="6" w:space="3" w:color="BF9B30"/>
-      </w:pBdr>
-      <w:spacing w:after="0" w:line="240" w:lineRule="auto"/>
-      <w:jc w:val="right"/>
-    </w:pPr>
-    <w:r>
-      <w:rPr>
-        <w:rFonts w:ascii="Arial" w:hAnsi="Arial"/>
-        <w:color w:val="2E5F8A"/>
-        <w:sz w:val="18"/>
-      </w:rPr>
-      <w:t>TOPDIC Constructora S. de R.L.</w:t>
-    </w:r>
-  </w:p>
-</w:hdr>
 </file>
 
 <file path=word/numbering.xml><?xml version="1.0" encoding="utf-8"?>
@@ -10099,6 +9062,10 @@
     <w:unhideWhenUsed/>
     <w:rsid w:val="00E618BF"/>
     <w:pPr>
+      <w:tabs>
+        <w:tab w:val="center" w:pos="4680"/>
+        <w:tab w:val="right" w:pos="9360"/>
+      </w:tabs>
       <w:spacing w:after="0" w:line="240" w:lineRule="auto"/>
     </w:pPr>
   </w:style>
@@ -10117,6 +9084,10 @@
     <w:unhideWhenUsed/>
     <w:rsid w:val="00E618BF"/>
     <w:pPr>
+      <w:tabs>
+        <w:tab w:val="center" w:pos="4680"/>
+        <w:tab w:val="right" w:pos="9360"/>
+      </w:tabs>
       <w:spacing w:after="0" w:line="240" w:lineRule="auto"/>
     </w:pPr>
   </w:style>

</xml_diff>